<commit_message>
Naval Blockade and one man show
</commit_message>
<xml_diff>
--- a/Glenn Diesen - talks/Jiang Xueqin The Iran War and the Battle for the Petrodollar.docx
+++ b/Glenn Diesen - talks/Jiang Xueqin The Iran War and the Battle for the Petrodollar.docx
@@ -4,6 +4,29 @@
   <w:body>
     <w:p>
       <w:pPr>
+        <w:jc w:val="both"/>
+        <w:rPr>
+          <w:lang w:val="en-US"/>
+        </w:rPr>
+      </w:pPr>
+      <w:r>
+        <w:rPr>
+          <w:lang w:val="en-US"/>
+        </w:rPr>
+        <w:t>https://www.youtube.com/watch?v=P_DHMUdOVdo</w:t>
+      </w:r>
+    </w:p>
+    <w:p>
+      <w:pPr>
+        <w:jc w:val="both"/>
+        <w:rPr>
+          <w:lang w:val="en-US"/>
+        </w:rPr>
+      </w:pPr>
+    </w:p>
+    <w:p>
+      <w:pPr>
+        <w:jc w:val="both"/>
         <w:rPr>
           <w:lang w:val="en-US"/>
         </w:rPr>
@@ -17,6 +40,7 @@
     </w:p>
     <w:p>
       <w:pPr>
+        <w:jc w:val="both"/>
         <w:rPr>
           <w:lang w:val="en-US"/>
         </w:rPr>
@@ -60,6 +84,7 @@
     </w:p>
     <w:p>
       <w:pPr>
+        <w:jc w:val="both"/>
         <w:rPr>
           <w:lang w:val="en-US"/>
         </w:rPr>
@@ -85,6 +110,7 @@
     </w:p>
     <w:p>
       <w:pPr>
+        <w:jc w:val="both"/>
         <w:rPr>
           <w:lang w:val="en-US"/>
         </w:rPr>
@@ -98,6 +124,7 @@
     </w:p>
     <w:p>
       <w:pPr>
+        <w:jc w:val="both"/>
         <w:rPr>
           <w:lang w:val="en-US"/>
         </w:rPr>
@@ -135,6 +162,7 @@
     </w:p>
     <w:p>
       <w:pPr>
+        <w:jc w:val="both"/>
         <w:rPr>
           <w:lang w:val="en-US"/>
         </w:rPr>
@@ -192,6 +220,7 @@
     </w:p>
     <w:p>
       <w:pPr>
+        <w:jc w:val="both"/>
         <w:rPr>
           <w:lang w:val="en-US"/>
         </w:rPr>
@@ -230,6 +259,7 @@
     </w:p>
     <w:p>
       <w:pPr>
+        <w:jc w:val="both"/>
         <w:rPr>
           <w:lang w:val="en-US"/>
         </w:rPr>
@@ -243,6 +273,7 @@
     </w:p>
     <w:p>
       <w:pPr>
+        <w:jc w:val="both"/>
         <w:rPr>
           <w:lang w:val="en-US"/>
         </w:rPr>
@@ -256,6 +287,7 @@
     </w:p>
     <w:p>
       <w:pPr>
+        <w:jc w:val="both"/>
         <w:rPr>
           <w:lang w:val="en-US"/>
         </w:rPr>
@@ -269,6 +301,7 @@
     </w:p>
     <w:p>
       <w:pPr>
+        <w:jc w:val="both"/>
         <w:rPr>
           <w:lang w:val="en-US"/>
         </w:rPr>
@@ -293,6 +326,7 @@
           <w:ilvl w:val="0"/>
           <w:numId w:val="2"/>
         </w:numPr>
+        <w:jc w:val="both"/>
         <w:rPr>
           <w:lang w:val="en-US"/>
         </w:rPr>
@@ -311,6 +345,7 @@
           <w:ilvl w:val="0"/>
           <w:numId w:val="2"/>
         </w:numPr>
+        <w:jc w:val="both"/>
         <w:rPr>
           <w:lang w:val="en-US"/>
         </w:rPr>
@@ -341,6 +376,7 @@
           <w:ilvl w:val="0"/>
           <w:numId w:val="2"/>
         </w:numPr>
+        <w:jc w:val="both"/>
         <w:rPr>
           <w:lang w:val="en-US"/>
         </w:rPr>
@@ -367,6 +403,7 @@
     <w:p>
       <w:pPr>
         <w:ind w:left="360"/>
+        <w:jc w:val="both"/>
         <w:rPr>
           <w:lang w:val="en-US"/>
         </w:rPr>
@@ -379,6 +416,7 @@
           <w:ilvl w:val="0"/>
           <w:numId w:val="2"/>
         </w:numPr>
+        <w:jc w:val="both"/>
         <w:rPr>
           <w:lang w:val="en-US"/>
         </w:rPr>
@@ -411,7 +449,14 @@
         <w:rPr>
           <w:lang w:val="en-US"/>
         </w:rPr>
-        <w:t xml:space="preserve"> The problem is, the US was protecting sea lines.</w:t>
+        <w:t xml:space="preserve"> The </w:t>
+      </w:r>
+      <w:r>
+        <w:rPr>
+          <w:lang w:val="en-US"/>
+        </w:rPr>
+        <w:lastRenderedPageBreak/>
+        <w:t>problem is, the US was protecting sea lines.</w:t>
       </w:r>
       <w:r>
         <w:rPr>
@@ -467,6 +512,7 @@
     <w:p>
       <w:pPr>
         <w:pStyle w:val="Akapitzlist"/>
+        <w:jc w:val="both"/>
         <w:rPr>
           <w:lang w:val="en-US"/>
         </w:rPr>
@@ -479,6 +525,7 @@
           <w:ilvl w:val="0"/>
           <w:numId w:val="2"/>
         </w:numPr>
+        <w:jc w:val="both"/>
         <w:rPr>
           <w:lang w:val="en-US"/>
         </w:rPr>
@@ -546,6 +593,7 @@
           <w:ilvl w:val="0"/>
           <w:numId w:val="2"/>
         </w:numPr>
+        <w:jc w:val="both"/>
         <w:rPr>
           <w:lang w:val="en-US"/>
         </w:rPr>
@@ -619,20 +667,23 @@
     </w:p>
     <w:p>
       <w:pPr>
-        <w:rPr>
-          <w:lang w:val="en-US"/>
-        </w:rPr>
-      </w:pPr>
-    </w:p>
-    <w:p>
-      <w:pPr>
-        <w:rPr>
-          <w:lang w:val="en-US"/>
-        </w:rPr>
-      </w:pPr>
-    </w:p>
-    <w:p>
-      <w:pPr>
+        <w:jc w:val="both"/>
+        <w:rPr>
+          <w:lang w:val="en-US"/>
+        </w:rPr>
+      </w:pPr>
+    </w:p>
+    <w:p>
+      <w:pPr>
+        <w:jc w:val="both"/>
+        <w:rPr>
+          <w:lang w:val="en-US"/>
+        </w:rPr>
+      </w:pPr>
+    </w:p>
+    <w:p>
+      <w:pPr>
+        <w:jc w:val="both"/>
         <w:rPr>
           <w:lang w:val="en-US"/>
         </w:rPr>
@@ -646,15 +697,28 @@
     </w:p>
     <w:p>
       <w:pPr>
-        <w:rPr>
-          <w:lang w:val="en-US"/>
-        </w:rPr>
-      </w:pPr>
-      <w:r>
-        <w:rPr>
-          <w:lang w:val="en-US"/>
-        </w:rPr>
-        <w:t>- In most wars US starter o</w:t>
+        <w:jc w:val="both"/>
+        <w:rPr>
+          <w:lang w:val="en-US"/>
+        </w:rPr>
+      </w:pPr>
+      <w:r>
+        <w:rPr>
+          <w:lang w:val="en-US"/>
+        </w:rPr>
+        <w:t>- In most wars</w:t>
+      </w:r>
+      <w:r>
+        <w:rPr>
+          <w:lang w:val="en-US"/>
+        </w:rPr>
+        <w:t xml:space="preserve"> that</w:t>
+      </w:r>
+      <w:r>
+        <w:rPr>
+          <w:lang w:val="en-US"/>
+        </w:rPr>
+        <w:t xml:space="preserve"> US starter o</w:t>
       </w:r>
       <w:r>
         <w:rPr>
@@ -690,6 +754,7 @@
     </w:p>
     <w:p>
       <w:pPr>
+        <w:jc w:val="both"/>
         <w:rPr>
           <w:lang w:val="en-US"/>
         </w:rPr>
@@ -715,6 +780,7 @@
     </w:p>
     <w:p>
       <w:pPr>
+        <w:jc w:val="both"/>
         <w:rPr>
           <w:lang w:val="en-US"/>
         </w:rPr>
@@ -735,6 +801,7 @@
     </w:p>
     <w:p>
       <w:pPr>
+        <w:jc w:val="both"/>
         <w:rPr>
           <w:lang w:val="en-US"/>
         </w:rPr>
@@ -761,6 +828,7 @@
     </w:p>
     <w:p>
       <w:pPr>
+        <w:jc w:val="both"/>
         <w:rPr>
           <w:lang w:val="en-US"/>
         </w:rPr>
@@ -798,6 +866,7 @@
     </w:p>
     <w:p>
       <w:pPr>
+        <w:jc w:val="both"/>
         <w:rPr>
           <w:lang w:val="en-US"/>
         </w:rPr>
@@ -817,6 +886,7 @@
     </w:p>
     <w:p>
       <w:pPr>
+        <w:jc w:val="both"/>
         <w:rPr>
           <w:lang w:val="en-US"/>
         </w:rPr>
@@ -861,28 +931,30 @@
     </w:p>
     <w:p>
       <w:pPr>
-        <w:rPr>
-          <w:lang w:val="en-US"/>
-        </w:rPr>
-      </w:pPr>
-      <w:r>
-        <w:rPr>
-          <w:lang w:val="en-US"/>
-        </w:rPr>
+        <w:jc w:val="both"/>
+        <w:rPr>
+          <w:lang w:val="en-US"/>
+        </w:rPr>
+      </w:pPr>
+      <w:r>
+        <w:rPr>
+          <w:lang w:val="en-US"/>
+        </w:rPr>
+        <w:lastRenderedPageBreak/>
         <w:t xml:space="preserve">Questions: </w:t>
       </w:r>
     </w:p>
     <w:p>
       <w:pPr>
-        <w:rPr>
-          <w:lang w:val="en-US"/>
-        </w:rPr>
-      </w:pPr>
-      <w:r>
-        <w:rPr>
-          <w:lang w:val="en-US"/>
-        </w:rPr>
-        <w:lastRenderedPageBreak/>
+        <w:jc w:val="both"/>
+        <w:rPr>
+          <w:lang w:val="en-US"/>
+        </w:rPr>
+      </w:pPr>
+      <w:r>
+        <w:rPr>
+          <w:lang w:val="en-US"/>
+        </w:rPr>
         <w:t xml:space="preserve">How will a Petro-currency (collar, euro, yuan) </w:t>
       </w:r>
       <w:r>
@@ -912,6 +984,7 @@
     </w:p>
     <w:p>
       <w:pPr>
+        <w:jc w:val="both"/>
         <w:rPr>
           <w:lang w:val="en-US"/>
         </w:rPr>
@@ -920,6 +993,7 @@
     <w:p>
       <w:pPr>
         <w:keepNext/>
+        <w:jc w:val="both"/>
       </w:pPr>
       <w:r>
         <w:rPr>
@@ -966,6 +1040,7 @@
     <w:p>
       <w:pPr>
         <w:pStyle w:val="Legenda"/>
+        <w:jc w:val="both"/>
       </w:pPr>
       <w:r>
         <w:rPr>
@@ -1000,8 +1075,40 @@
         </w:rPr>
         <w:fldChar w:fldCharType="end"/>
       </w:r>
-      <w:r>
-        <w:t>https://lowcarbonpower.org/region/EU</w:t>
+      <w:hyperlink r:id="rId9" w:history="1">
+        <w:r>
+          <w:rPr>
+            <w:rStyle w:val="Hipercze"/>
+          </w:rPr>
+          <w:t>https://lowcarbonpower.org/region/EU</w:t>
+        </w:r>
+      </w:hyperlink>
+    </w:p>
+    <w:p/>
+    <w:p>
+      <w:pPr>
+        <w:rPr>
+          <w:lang w:val="en-US"/>
+        </w:rPr>
+      </w:pPr>
+      <w:r>
+        <w:rPr>
+          <w:lang w:val="en-US"/>
+        </w:rPr>
+        <w:t>Comment: Presonally have a lot o</w:t>
+      </w:r>
+      <w:r>
+        <w:rPr>
+          <w:lang w:val="en-US"/>
+        </w:rPr>
+        <w:t xml:space="preserve">f problems with theories of Jiang Xueqin about US aggression on Iran. It seems very retrospectively. It shows the conflict like a grand and successful plan of the US to extorn money from the world. How are you going to take a toll if you are showing that you canot block sea lines or have to take detours around Africa (us navy ships don’t want to cross red sea anymore because of the Houties). Are we gonna ignore facts that it was Israel that pushed US into that conflict? Will we assume that decapitation strike would never made a lasting and devasteiting impression on Iranian leaders (so they would not collapse in a moment) and we should </w:t>
+      </w:r>
+      <w:r>
+        <w:rPr>
+          <w:lang w:val="en-US"/>
+        </w:rPr>
+        <w:lastRenderedPageBreak/>
+        <w:t>assume that Iran would always horisontaly escalate conflict?  Why US would like to control a resource in decline? (oil)</w:t>
       </w:r>
     </w:p>
     <w:sectPr>
@@ -1081,19 +1188,11 @@
         </w:rPr>
         <w:t xml:space="preserve"> </w:t>
       </w:r>
-      <w:proofErr w:type="spellStart"/>
-      <w:r>
-        <w:rPr>
-          <w:lang w:val="en-US"/>
-        </w:rPr>
-        <w:t>Isint</w:t>
-      </w:r>
-      <w:proofErr w:type="spellEnd"/>
-      <w:r>
-        <w:rPr>
-          <w:lang w:val="en-US"/>
-        </w:rPr>
-        <w:t xml:space="preserve"> it something that the world is already doing?</w:t>
+      <w:r>
+        <w:rPr>
+          <w:lang w:val="en-US"/>
+        </w:rPr>
+        <w:t>Isint it something that the world is already doing?</w:t>
       </w:r>
     </w:p>
   </w:footnote>
@@ -1127,21 +1226,7 @@
         <w:rPr>
           <w:lang w:val="en-US"/>
         </w:rPr>
-        <w:t xml:space="preserve"> Moreover, if the attack on Iran would succeed, then Gulf States would not need security </w:t>
-      </w:r>
-      <w:proofErr w:type="spellStart"/>
-      <w:r>
-        <w:rPr>
-          <w:lang w:val="en-US"/>
-        </w:rPr>
-        <w:t>guarantiees</w:t>
-      </w:r>
-      <w:proofErr w:type="spellEnd"/>
-      <w:r>
-        <w:rPr>
-          <w:lang w:val="en-US"/>
-        </w:rPr>
-        <w:t xml:space="preserve"> of US and its power over them would diminish. It just doesn’t add up.</w:t>
+        <w:t xml:space="preserve"> Moreover, if the attack on Iran would succeed, then Gulf States would not need security guarantiees of US and its power over them would diminish. It just doesn’t add up.</w:t>
       </w:r>
     </w:p>
   </w:footnote>
@@ -1303,21 +1388,7 @@
         <w:rPr>
           <w:lang w:val="en-US"/>
         </w:rPr>
-        <w:t xml:space="preserve"> </w:t>
-      </w:r>
-      <w:proofErr w:type="spellStart"/>
-      <w:r>
-        <w:rPr>
-          <w:lang w:val="en-US"/>
-        </w:rPr>
-        <w:t>Isint</w:t>
-      </w:r>
-      <w:proofErr w:type="spellEnd"/>
-      <w:r>
-        <w:rPr>
-          <w:lang w:val="en-US"/>
-        </w:rPr>
-        <w:t xml:space="preserve"> oil and gas diminishing i</w:t>
+        <w:t xml:space="preserve"> Isint oil and gas diminishing i</w:t>
       </w:r>
       <w:r>
         <w:rPr>
@@ -1351,21 +1422,8 @@
         <w:footnoteRef/>
       </w:r>
       <w:r>
-        <w:t xml:space="preserve"> ‘</w:t>
-      </w:r>
-      <w:proofErr w:type="spellStart"/>
-      <w:r>
-        <w:t>protected</w:t>
-      </w:r>
-      <w:proofErr w:type="spellEnd"/>
-      <w:r>
-        <w:t xml:space="preserve">’… from </w:t>
-      </w:r>
-      <w:proofErr w:type="spellStart"/>
-      <w:r>
-        <w:t>itself</w:t>
-      </w:r>
-      <w:proofErr w:type="spellEnd"/>
+        <w:t xml:space="preserve"> ‘protected’… from itself</w:t>
+      </w:r>
     </w:p>
   </w:footnote>
   <w:footnote w:id="10">
@@ -1392,21 +1450,7 @@
         <w:rPr>
           <w:lang w:val="en-US"/>
         </w:rPr>
-        <w:t xml:space="preserve">ussia (even if fought via proxies) and China is a war between globalists and nationalists??? Because MAGA doesn’t sound very </w:t>
-      </w:r>
-      <w:proofErr w:type="spellStart"/>
-      <w:r>
-        <w:rPr>
-          <w:lang w:val="en-US"/>
-        </w:rPr>
-        <w:t>globalistic</w:t>
-      </w:r>
-      <w:proofErr w:type="spellEnd"/>
-      <w:r>
-        <w:rPr>
-          <w:lang w:val="en-US"/>
-        </w:rPr>
-        <w:t xml:space="preserve">. </w:t>
+        <w:t xml:space="preserve">ussia (even if fought via proxies) and China is a war between globalists and nationalists??? Because MAGA doesn’t sound very globalistic. </w:t>
       </w:r>
     </w:p>
   </w:footnote>
@@ -2625,6 +2669,29 @@
       <w:szCs w:val="18"/>
     </w:rPr>
   </w:style>
+  <w:style w:type="character" w:styleId="Hipercze">
+    <w:name w:val="Hyperlink"/>
+    <w:basedOn w:val="Domylnaczcionkaakapitu"/>
+    <w:uiPriority w:val="99"/>
+    <w:unhideWhenUsed/>
+    <w:rsid w:val="00197C24"/>
+    <w:rPr>
+      <w:color w:val="467886" w:themeColor="hyperlink"/>
+      <w:u w:val="single"/>
+    </w:rPr>
+  </w:style>
+  <w:style w:type="character" w:styleId="Nierozpoznanawzmianka">
+    <w:name w:val="Unresolved Mention"/>
+    <w:basedOn w:val="Domylnaczcionkaakapitu"/>
+    <w:uiPriority w:val="99"/>
+    <w:semiHidden/>
+    <w:unhideWhenUsed/>
+    <w:rsid w:val="00197C24"/>
+    <w:rPr>
+      <w:color w:val="605E5C"/>
+      <w:shd w:val="clear" w:color="auto" w:fill="E1DFDD"/>
+    </w:rPr>
+  </w:style>
 </w:styles>
 </file>
 

</xml_diff>